<commit_message>
fix(templates): sostituisci {%tr %} con {%p %} in tutti i template
I tag {%tr for/endfor %} funzionano solo dentro tabelle Word (<w:tr>).
Nei template le sezioni (skills, cert, edu, lang) sono in paragrafi body
→ sostituiti con {%p for/endfor %} che e' il tag corretto per paragrafi.

Verificato con render docxtpl su tutti e 3 i template: tutti OK.
Template_IT_Esempio.docx: anche merge run spezzati (5 paragrafi).

Co-Authored-By: Claude Sonnet 4.6 <noreply@anthropic.com>
</commit_message>
<xml_diff>
--- a/backend/app/templates/docx/Template_EN_Standard_Mashfrog_v1.docx
+++ b/backend/app/templates/docx/Template_EN_Standard_Mashfrog_v1.docx
@@ -1114,7 +1114,7 @@
           <w:szCs w:val="20"/>
           <w:lang w:val="en-GB"/>
         </w:rPr>
-        <w:t>exp.activities</w:t>
+        <w:t>ref.activities</w:t>
       </w:r>
       <w:proofErr w:type="spellEnd"/>
       <w:proofErr w:type="gramEnd"/>
@@ -1135,6 +1135,7 @@
           <w:b/>
           <w:color w:val="000000"/>
           <w:sz w:val="18"/>
+          <w:lang w:val="en-GB"/>
         </w:rPr>
       </w:pPr>
       <w:r>
@@ -1142,66 +1143,67 @@
           <w:b/>
           <w:color w:val="000000"/>
           <w:sz w:val="18"/>
-        </w:rPr>
-        <w:t xml:space="preserve">Activities </w:t>
-      </w:r>
-      <w:proofErr w:type="spellStart"/>
+          <w:lang w:val="en-GB"/>
+        </w:rPr>
+        <w:t>Activities performed</w:t>
+      </w:r>
       <w:proofErr w:type="gramStart"/>
       <w:r>
         <w:rPr>
           <w:b/>
           <w:color w:val="000000"/>
           <w:sz w:val="18"/>
-        </w:rPr>
-        <w:t>performed</w:t>
+          <w:lang w:val="en-GB"/>
+        </w:rPr>
+        <w:t xml:space="preserve">: </w:t>
+      </w:r>
+      <w:r>
+        <w:rPr>
+          <w:rFonts w:ascii="Arial Narrow" w:eastAsia="Arial Narrow" w:hAnsi="Arial Narrow" w:cs="Arial Narrow"/>
+          <w:sz w:val="20"/>
+          <w:szCs w:val="20"/>
+          <w:lang w:val="en-GB"/>
+        </w:rPr>
+        <w:t xml:space="preserve"> </w:t>
+      </w:r>
+      <w:r>
+        <w:rPr>
+          <w:rFonts w:ascii="Arial Narrow" w:eastAsia="Arial Narrow" w:hAnsi="Arial Narrow" w:cs="Arial Narrow"/>
+          <w:sz w:val="20"/>
+          <w:szCs w:val="20"/>
+        </w:rPr>
+        <w:t xml:space="preserve">{{ </w:t>
+      </w:r>
+      <w:proofErr w:type="spellStart"/>
+      <w:r>
+        <w:rPr>
+          <w:rFonts w:ascii="Arial Narrow" w:eastAsia="Arial Narrow" w:hAnsi="Arial Narrow" w:cs="Arial Narrow"/>
+          <w:sz w:val="20"/>
+          <w:szCs w:val="20"/>
+        </w:rPr>
+        <w:t>ref</w:t>
+      </w:r>
+      <w:proofErr w:type="gramEnd"/>
+      <w:r>
+        <w:rPr>
+          <w:rFonts w:ascii="Arial Narrow" w:eastAsia="Arial Narrow" w:hAnsi="Arial Narrow" w:cs="Arial Narrow"/>
+          <w:sz w:val="20"/>
+          <w:szCs w:val="20"/>
+        </w:rPr>
+        <w:t>.</w:t>
+      </w:r>
+      <w:proofErr w:type="gramStart"/>
+      <w:r>
+        <w:rPr>
+          <w:rFonts w:ascii="Arial Narrow" w:eastAsia="Arial Narrow" w:hAnsi="Arial Narrow" w:cs="Arial Narrow"/>
+          <w:sz w:val="20"/>
+          <w:szCs w:val="20"/>
+        </w:rPr>
+        <w:t>activities</w:t>
       </w:r>
       <w:proofErr w:type="spellEnd"/>
       <w:r>
         <w:rPr>
-          <w:b/>
-          <w:color w:val="000000"/>
-          <w:sz w:val="18"/>
-        </w:rPr>
-        <w:t xml:space="preserve">: </w:t>
-      </w:r>
-      <w:r>
-        <w:rPr>
-          <w:rFonts w:ascii="Arial Narrow" w:eastAsia="Arial Narrow" w:hAnsi="Arial Narrow" w:cs="Arial Narrow"/>
-          <w:sz w:val="20"/>
-          <w:szCs w:val="20"/>
-        </w:rPr>
-        <w:t xml:space="preserve"> {{ </w:t>
-      </w:r>
-      <w:proofErr w:type="spellStart"/>
-      <w:r>
-        <w:rPr>
-          <w:rFonts w:ascii="Arial Narrow" w:eastAsia="Arial Narrow" w:hAnsi="Arial Narrow" w:cs="Arial Narrow"/>
-          <w:sz w:val="20"/>
-          <w:szCs w:val="20"/>
-        </w:rPr>
-        <w:t>exp</w:t>
-      </w:r>
-      <w:proofErr w:type="gramEnd"/>
-      <w:r>
-        <w:rPr>
-          <w:rFonts w:ascii="Arial Narrow" w:eastAsia="Arial Narrow" w:hAnsi="Arial Narrow" w:cs="Arial Narrow"/>
-          <w:sz w:val="20"/>
-          <w:szCs w:val="20"/>
-        </w:rPr>
-        <w:t>.</w:t>
-      </w:r>
-      <w:proofErr w:type="gramStart"/>
-      <w:r>
-        <w:rPr>
-          <w:rFonts w:ascii="Arial Narrow" w:eastAsia="Arial Narrow" w:hAnsi="Arial Narrow" w:cs="Arial Narrow"/>
-          <w:sz w:val="20"/>
-          <w:szCs w:val="20"/>
-        </w:rPr>
-        <w:t>activities</w:t>
-      </w:r>
-      <w:proofErr w:type="spellEnd"/>
-      <w:r>
-        <w:rPr>
           <w:rFonts w:ascii="Arial Narrow" w:eastAsia="Arial Narrow" w:hAnsi="Arial Narrow" w:cs="Arial Narrow"/>
           <w:sz w:val="20"/>
           <w:szCs w:val="20"/>
@@ -1225,33 +1227,17 @@
           <w:rFonts w:ascii="Arial Narrow" w:eastAsia="Arial Narrow" w:hAnsi="Arial Narrow" w:cs="Arial Narrow"/>
           <w:sz w:val="20"/>
           <w:szCs w:val="20"/>
-        </w:rPr>
-      </w:pPr>
-      <w:r>
-        <w:rPr>
-          <w:rFonts w:ascii="Arial Narrow" w:eastAsia="Arial Narrow" w:hAnsi="Arial Narrow" w:cs="Arial Narrow"/>
-          <w:sz w:val="20"/>
-          <w:szCs w:val="20"/>
-        </w:rPr>
-        <w:t xml:space="preserve">{% </w:t>
-      </w:r>
-      <w:proofErr w:type="spellStart"/>
-      <w:r>
-        <w:rPr>
-          <w:rFonts w:ascii="Arial Narrow" w:eastAsia="Arial Narrow" w:hAnsi="Arial Narrow" w:cs="Arial Narrow"/>
-          <w:sz w:val="20"/>
-          <w:szCs w:val="20"/>
-        </w:rPr>
-        <w:t>endif</w:t>
-      </w:r>
-      <w:proofErr w:type="spellEnd"/>
-      <w:r>
-        <w:rPr>
-          <w:rFonts w:ascii="Arial Narrow" w:eastAsia="Arial Narrow" w:hAnsi="Arial Narrow" w:cs="Arial Narrow"/>
-          <w:sz w:val="20"/>
-          <w:szCs w:val="20"/>
-        </w:rPr>
-        <w:t xml:space="preserve"> %}</w:t>
+          <w:lang w:val="en-GB"/>
+        </w:rPr>
+      </w:pPr>
+      <w:r>
+        <w:rPr>
+          <w:rFonts w:ascii="Arial Narrow" w:eastAsia="Arial Narrow" w:hAnsi="Arial Narrow" w:cs="Arial Narrow"/>
+          <w:sz w:val="20"/>
+          <w:szCs w:val="20"/>
+          <w:lang w:val="en-GB"/>
+        </w:rPr>
+        <w:t>{% endif %}</w:t>
       </w:r>
     </w:p>
     <w:p>
@@ -1261,6 +1247,7 @@
           <w:rFonts w:ascii="Arial Narrow" w:eastAsia="Arial Narrow" w:hAnsi="Arial Narrow" w:cs="Arial Narrow"/>
           <w:sz w:val="20"/>
           <w:szCs w:val="20"/>
+          <w:lang w:val="en-GB"/>
         </w:rPr>
       </w:pPr>
     </w:p>
@@ -1363,7 +1350,7 @@
           <w:szCs w:val="20"/>
           <w:lang w:val="en-GB"/>
         </w:rPr>
-        <w:t xml:space="preserve">{%tr for </w:t>
+        <w:t>{%p for edu in educations %}</w:t>
       </w:r>
       <w:proofErr w:type="spellStart"/>
       <w:r>
@@ -1373,8 +1360,67 @@
           <w:szCs w:val="20"/>
           <w:lang w:val="en-GB"/>
         </w:rPr>
+      </w:r>
+      <w:proofErr w:type="spellEnd"/>
+      <w:r>
+        <w:rPr>
+          <w:rFonts w:ascii="Arial Narrow" w:eastAsia="Arial Narrow" w:hAnsi="Arial Narrow" w:cs="Arial Narrow"/>
+          <w:sz w:val="20"/>
+          <w:szCs w:val="20"/>
+          <w:lang w:val="en-GB"/>
+        </w:rPr>
+      </w:r>
+    </w:p>
+    <w:p>
+      <w:pPr>
+        <w:spacing w:after="0"/>
+        <w:rPr>
+          <w:rFonts w:ascii="Arial Narrow" w:eastAsia="Arial Narrow" w:hAnsi="Arial Narrow" w:cs="Arial Narrow"/>
+          <w:sz w:val="20"/>
+          <w:szCs w:val="20"/>
+          <w:lang w:val="en-GB"/>
+        </w:rPr>
+      </w:pPr>
+      <w:proofErr w:type="gramStart"/>
+      <w:r>
+        <w:rPr>
+          <w:rFonts w:ascii="Arial Narrow" w:eastAsia="Arial Narrow" w:hAnsi="Arial Narrow" w:cs="Arial Narrow"/>
+          <w:sz w:val="20"/>
+          <w:szCs w:val="20"/>
+          <w:lang w:val="en-GB"/>
+        </w:rPr>
+        <w:t xml:space="preserve">{{ </w:t>
+      </w:r>
+      <w:proofErr w:type="spellStart"/>
+      <w:r>
+        <w:rPr>
+          <w:rFonts w:ascii="Arial Narrow" w:eastAsia="Arial Narrow" w:hAnsi="Arial Narrow" w:cs="Arial Narrow"/>
+          <w:sz w:val="20"/>
+          <w:szCs w:val="20"/>
+          <w:lang w:val="en-GB"/>
+        </w:rPr>
         <w:t>edu</w:t>
       </w:r>
+      <w:proofErr w:type="gramEnd"/>
+      <w:r>
+        <w:rPr>
+          <w:rFonts w:ascii="Arial Narrow" w:eastAsia="Arial Narrow" w:hAnsi="Arial Narrow" w:cs="Arial Narrow"/>
+          <w:sz w:val="20"/>
+          <w:szCs w:val="20"/>
+          <w:lang w:val="en-GB"/>
+        </w:rPr>
+        <w:t>.graduation_</w:t>
+      </w:r>
+      <w:proofErr w:type="gramStart"/>
+      <w:r>
+        <w:rPr>
+          <w:rFonts w:ascii="Arial Narrow" w:eastAsia="Arial Narrow" w:hAnsi="Arial Narrow" w:cs="Arial Narrow"/>
+          <w:sz w:val="20"/>
+          <w:szCs w:val="20"/>
+          <w:lang w:val="en-GB"/>
+        </w:rPr>
+        <w:t>year</w:t>
+      </w:r>
       <w:proofErr w:type="spellEnd"/>
       <w:r>
         <w:rPr>
@@ -1383,7 +1429,299 @@
           <w:szCs w:val="20"/>
           <w:lang w:val="en-GB"/>
         </w:rPr>
-        <w:t xml:space="preserve"> in educations %}</w:t>
+        <w:t xml:space="preserve"> }</w:t>
+      </w:r>
+      <w:proofErr w:type="gramEnd"/>
+      <w:r>
+        <w:rPr>
+          <w:rFonts w:ascii="Arial Narrow" w:eastAsia="Arial Narrow" w:hAnsi="Arial Narrow" w:cs="Arial Narrow"/>
+          <w:sz w:val="20"/>
+          <w:szCs w:val="20"/>
+          <w:lang w:val="en-GB"/>
+        </w:rPr>
+        <w:t xml:space="preserve">} </w:t>
+      </w:r>
+      <w:proofErr w:type="gramStart"/>
+      <w:r>
+        <w:rPr>
+          <w:rFonts w:ascii="Arial Narrow" w:eastAsia="Arial Narrow" w:hAnsi="Arial Narrow" w:cs="Arial Narrow"/>
+          <w:sz w:val="20"/>
+          <w:szCs w:val="20"/>
+          <w:lang w:val="en-GB"/>
+        </w:rPr>
+        <w:t xml:space="preserve">   {{ </w:t>
+      </w:r>
+      <w:proofErr w:type="spellStart"/>
+      <w:r>
+        <w:rPr>
+          <w:rFonts w:ascii="Arial Narrow" w:eastAsia="Arial Narrow" w:hAnsi="Arial Narrow" w:cs="Arial Narrow"/>
+          <w:sz w:val="20"/>
+          <w:szCs w:val="20"/>
+          <w:lang w:val="en-GB"/>
+        </w:rPr>
+        <w:t>edu</w:t>
+      </w:r>
+      <w:proofErr w:type="gramEnd"/>
+      <w:r>
+        <w:rPr>
+          <w:rFonts w:ascii="Arial Narrow" w:eastAsia="Arial Narrow" w:hAnsi="Arial Narrow" w:cs="Arial Narrow"/>
+          <w:sz w:val="20"/>
+          <w:szCs w:val="20"/>
+          <w:lang w:val="en-GB"/>
+        </w:rPr>
+        <w:t>.degree_</w:t>
+      </w:r>
+      <w:proofErr w:type="gramStart"/>
+      <w:r>
+        <w:rPr>
+          <w:rFonts w:ascii="Arial Narrow" w:eastAsia="Arial Narrow" w:hAnsi="Arial Narrow" w:cs="Arial Narrow"/>
+          <w:sz w:val="20"/>
+          <w:szCs w:val="20"/>
+          <w:lang w:val="en-GB"/>
+        </w:rPr>
+        <w:t>level</w:t>
+      </w:r>
+      <w:proofErr w:type="spellEnd"/>
+      <w:r>
+        <w:rPr>
+          <w:rFonts w:ascii="Arial Narrow" w:eastAsia="Arial Narrow" w:hAnsi="Arial Narrow" w:cs="Arial Narrow"/>
+          <w:sz w:val="20"/>
+          <w:szCs w:val="20"/>
+          <w:lang w:val="en-GB"/>
+        </w:rPr>
+        <w:t xml:space="preserve"> }</w:t>
+      </w:r>
+      <w:proofErr w:type="gramEnd"/>
+      <w:r>
+        <w:rPr>
+          <w:rFonts w:ascii="Arial Narrow" w:eastAsia="Arial Narrow" w:hAnsi="Arial Narrow" w:cs="Arial Narrow"/>
+          <w:sz w:val="20"/>
+          <w:szCs w:val="20"/>
+          <w:lang w:val="en-GB"/>
+        </w:rPr>
+        <w:t xml:space="preserve">}  </w:t>
+      </w:r>
+      <w:proofErr w:type="gramStart"/>
+      <w:r>
+        <w:rPr>
+          <w:rFonts w:ascii="Arial Narrow" w:eastAsia="Arial Narrow" w:hAnsi="Arial Narrow" w:cs="Arial Narrow"/>
+          <w:sz w:val="20"/>
+          <w:szCs w:val="20"/>
+          <w:lang w:val="en-GB"/>
+        </w:rPr>
+        <w:t xml:space="preserve">–  {{ </w:t>
+      </w:r>
+      <w:proofErr w:type="spellStart"/>
+      <w:r>
+        <w:rPr>
+          <w:rFonts w:ascii="Arial Narrow" w:eastAsia="Arial Narrow" w:hAnsi="Arial Narrow" w:cs="Arial Narrow"/>
+          <w:sz w:val="20"/>
+          <w:szCs w:val="20"/>
+          <w:lang w:val="en-GB"/>
+        </w:rPr>
+        <w:t>edu</w:t>
+      </w:r>
+      <w:proofErr w:type="gramEnd"/>
+      <w:r>
+        <w:rPr>
+          <w:rFonts w:ascii="Arial Narrow" w:eastAsia="Arial Narrow" w:hAnsi="Arial Narrow" w:cs="Arial Narrow"/>
+          <w:sz w:val="20"/>
+          <w:szCs w:val="20"/>
+          <w:lang w:val="en-GB"/>
+        </w:rPr>
+        <w:t>.field_of_</w:t>
+      </w:r>
+      <w:proofErr w:type="gramStart"/>
+      <w:r>
+        <w:rPr>
+          <w:rFonts w:ascii="Arial Narrow" w:eastAsia="Arial Narrow" w:hAnsi="Arial Narrow" w:cs="Arial Narrow"/>
+          <w:sz w:val="20"/>
+          <w:szCs w:val="20"/>
+          <w:lang w:val="en-GB"/>
+        </w:rPr>
+        <w:t>study</w:t>
+      </w:r>
+      <w:proofErr w:type="spellEnd"/>
+      <w:r>
+        <w:rPr>
+          <w:rFonts w:ascii="Arial Narrow" w:eastAsia="Arial Narrow" w:hAnsi="Arial Narrow" w:cs="Arial Narrow"/>
+          <w:sz w:val="20"/>
+          <w:szCs w:val="20"/>
+          <w:lang w:val="en-GB"/>
+        </w:rPr>
+        <w:t xml:space="preserve"> }</w:t>
+      </w:r>
+      <w:proofErr w:type="gramEnd"/>
+      <w:r>
+        <w:rPr>
+          <w:rFonts w:ascii="Arial Narrow" w:eastAsia="Arial Narrow" w:hAnsi="Arial Narrow" w:cs="Arial Narrow"/>
+          <w:sz w:val="20"/>
+          <w:szCs w:val="20"/>
+          <w:lang w:val="en-GB"/>
+        </w:rPr>
+        <w:t xml:space="preserve">} </w:t>
+      </w:r>
+      <w:proofErr w:type="gramStart"/>
+      <w:r>
+        <w:rPr>
+          <w:rFonts w:ascii="Arial Narrow" w:eastAsia="Arial Narrow" w:hAnsi="Arial Narrow" w:cs="Arial Narrow"/>
+          <w:sz w:val="20"/>
+          <w:szCs w:val="20"/>
+          <w:lang w:val="en-GB"/>
+        </w:rPr>
+        <w:t xml:space="preserve">   {{ </w:t>
+      </w:r>
+      <w:proofErr w:type="spellStart"/>
+      <w:r>
+        <w:rPr>
+          <w:rFonts w:ascii="Arial Narrow" w:eastAsia="Arial Narrow" w:hAnsi="Arial Narrow" w:cs="Arial Narrow"/>
+          <w:sz w:val="20"/>
+          <w:szCs w:val="20"/>
+          <w:lang w:val="en-GB"/>
+        </w:rPr>
+        <w:t>edu</w:t>
+      </w:r>
+      <w:proofErr w:type="gramEnd"/>
+      <w:r>
+        <w:rPr>
+          <w:rFonts w:ascii="Arial Narrow" w:eastAsia="Arial Narrow" w:hAnsi="Arial Narrow" w:cs="Arial Narrow"/>
+          <w:sz w:val="20"/>
+          <w:szCs w:val="20"/>
+          <w:lang w:val="en-GB"/>
+        </w:rPr>
+        <w:t>.</w:t>
+      </w:r>
+      <w:proofErr w:type="gramStart"/>
+      <w:r>
+        <w:rPr>
+          <w:rFonts w:ascii="Arial Narrow" w:eastAsia="Arial Narrow" w:hAnsi="Arial Narrow" w:cs="Arial Narrow"/>
+          <w:sz w:val="20"/>
+          <w:szCs w:val="20"/>
+          <w:lang w:val="en-GB"/>
+        </w:rPr>
+        <w:t>institution</w:t>
+      </w:r>
+      <w:proofErr w:type="spellEnd"/>
+      <w:r>
+        <w:rPr>
+          <w:rFonts w:ascii="Arial Narrow" w:eastAsia="Arial Narrow" w:hAnsi="Arial Narrow" w:cs="Arial Narrow"/>
+          <w:sz w:val="20"/>
+          <w:szCs w:val="20"/>
+          <w:lang w:val="en-GB"/>
+        </w:rPr>
+        <w:t xml:space="preserve"> }}{</w:t>
+      </w:r>
+      <w:proofErr w:type="gramEnd"/>
+      <w:r>
+        <w:rPr>
+          <w:rFonts w:ascii="Arial Narrow" w:eastAsia="Arial Narrow" w:hAnsi="Arial Narrow" w:cs="Arial Narrow"/>
+          <w:sz w:val="20"/>
+          <w:szCs w:val="20"/>
+          <w:lang w:val="en-GB"/>
+        </w:rPr>
+        <w:t xml:space="preserve">% if </w:t>
+      </w:r>
+      <w:proofErr w:type="spellStart"/>
+      <w:proofErr w:type="gramStart"/>
+      <w:r>
+        <w:rPr>
+          <w:rFonts w:ascii="Arial Narrow" w:eastAsia="Arial Narrow" w:hAnsi="Arial Narrow" w:cs="Arial Narrow"/>
+          <w:sz w:val="20"/>
+          <w:szCs w:val="20"/>
+          <w:lang w:val="en-GB"/>
+        </w:rPr>
+        <w:t>edu.grade</w:t>
+      </w:r>
+      <w:proofErr w:type="spellEnd"/>
+      <w:proofErr w:type="gramEnd"/>
+      <w:r>
+        <w:rPr>
+          <w:rFonts w:ascii="Arial Narrow" w:eastAsia="Arial Narrow" w:hAnsi="Arial Narrow" w:cs="Arial Narrow"/>
+          <w:sz w:val="20"/>
+          <w:szCs w:val="20"/>
+          <w:lang w:val="en-GB"/>
+        </w:rPr>
+        <w:t xml:space="preserve"> </w:t>
+      </w:r>
+      <w:proofErr w:type="gramStart"/>
+      <w:r>
+        <w:rPr>
+          <w:rFonts w:ascii="Arial Narrow" w:eastAsia="Arial Narrow" w:hAnsi="Arial Narrow" w:cs="Arial Narrow"/>
+          <w:sz w:val="20"/>
+          <w:szCs w:val="20"/>
+          <w:lang w:val="en-GB"/>
+        </w:rPr>
+        <w:t>%}  –</w:t>
+      </w:r>
+      <w:proofErr w:type="gramEnd"/>
+      <w:r>
+        <w:rPr>
+          <w:rFonts w:ascii="Arial Narrow" w:eastAsia="Arial Narrow" w:hAnsi="Arial Narrow" w:cs="Arial Narrow"/>
+          <w:sz w:val="20"/>
+          <w:szCs w:val="20"/>
+          <w:lang w:val="en-GB"/>
+        </w:rPr>
+        <w:t xml:space="preserve">  </w:t>
+      </w:r>
+      <w:proofErr w:type="gramStart"/>
+      <w:r>
+        <w:rPr>
+          <w:rFonts w:ascii="Arial Narrow" w:eastAsia="Arial Narrow" w:hAnsi="Arial Narrow" w:cs="Arial Narrow"/>
+          <w:sz w:val="20"/>
+          <w:szCs w:val="20"/>
+          <w:lang w:val="en-GB"/>
+        </w:rPr>
+        <w:t xml:space="preserve">{{ </w:t>
+      </w:r>
+      <w:proofErr w:type="spellStart"/>
+      <w:r>
+        <w:rPr>
+          <w:rFonts w:ascii="Arial Narrow" w:eastAsia="Arial Narrow" w:hAnsi="Arial Narrow" w:cs="Arial Narrow"/>
+          <w:sz w:val="20"/>
+          <w:szCs w:val="20"/>
+          <w:lang w:val="en-GB"/>
+        </w:rPr>
+        <w:t>edu</w:t>
+      </w:r>
+      <w:proofErr w:type="gramEnd"/>
+      <w:r>
+        <w:rPr>
+          <w:rFonts w:ascii="Arial Narrow" w:eastAsia="Arial Narrow" w:hAnsi="Arial Narrow" w:cs="Arial Narrow"/>
+          <w:sz w:val="20"/>
+          <w:szCs w:val="20"/>
+          <w:lang w:val="en-GB"/>
+        </w:rPr>
+        <w:t>.</w:t>
+      </w:r>
+      <w:proofErr w:type="gramStart"/>
+      <w:r>
+        <w:rPr>
+          <w:rFonts w:ascii="Arial Narrow" w:eastAsia="Arial Narrow" w:hAnsi="Arial Narrow" w:cs="Arial Narrow"/>
+          <w:sz w:val="20"/>
+          <w:szCs w:val="20"/>
+          <w:lang w:val="en-GB"/>
+        </w:rPr>
+        <w:t>grade</w:t>
+      </w:r>
+      <w:proofErr w:type="spellEnd"/>
+      <w:r>
+        <w:rPr>
+          <w:rFonts w:ascii="Arial Narrow" w:eastAsia="Arial Narrow" w:hAnsi="Arial Narrow" w:cs="Arial Narrow"/>
+          <w:sz w:val="20"/>
+          <w:szCs w:val="20"/>
+          <w:lang w:val="en-GB"/>
+        </w:rPr>
+        <w:t xml:space="preserve"> }}{</w:t>
+      </w:r>
+      <w:proofErr w:type="gramEnd"/>
+      <w:r>
+        <w:rPr>
+          <w:rFonts w:ascii="Arial Narrow" w:eastAsia="Arial Narrow" w:hAnsi="Arial Narrow" w:cs="Arial Narrow"/>
+          <w:sz w:val="20"/>
+          <w:szCs w:val="20"/>
+          <w:lang w:val="en-GB"/>
+        </w:rPr>
+        <w:t>% endif %}</w:t>
       </w:r>
     </w:p>
     <w:p>
@@ -1396,15 +1734,25 @@
           <w:lang w:val="en-GB"/>
         </w:rPr>
       </w:pPr>
-      <w:proofErr w:type="gramStart"/>
-      <w:r>
-        <w:rPr>
-          <w:rFonts w:ascii="Arial Narrow" w:eastAsia="Arial Narrow" w:hAnsi="Arial Narrow" w:cs="Arial Narrow"/>
-          <w:sz w:val="20"/>
-          <w:szCs w:val="20"/>
-          <w:lang w:val="en-GB"/>
-        </w:rPr>
-        <w:t xml:space="preserve">{{ </w:t>
+    </w:p>
+    <w:p>
+      <w:pPr>
+        <w:spacing w:after="0"/>
+        <w:rPr>
+          <w:rFonts w:ascii="Arial Narrow" w:eastAsia="Arial Narrow" w:hAnsi="Arial Narrow" w:cs="Arial Narrow"/>
+          <w:sz w:val="20"/>
+          <w:szCs w:val="20"/>
+          <w:lang w:val="en-GB"/>
+        </w:rPr>
+      </w:pPr>
+      <w:r>
+        <w:rPr>
+          <w:rFonts w:ascii="Arial Narrow" w:eastAsia="Arial Narrow" w:hAnsi="Arial Narrow" w:cs="Arial Narrow"/>
+          <w:sz w:val="20"/>
+          <w:szCs w:val="20"/>
+          <w:lang w:val="en-GB"/>
+        </w:rPr>
+        <w:t>{%p endfor %}</w:t>
       </w:r>
       <w:proofErr w:type="spellStart"/>
       <w:r>
@@ -1414,27 +1762,6 @@
           <w:szCs w:val="20"/>
           <w:lang w:val="en-GB"/>
         </w:rPr>
-        <w:t>edu</w:t>
-      </w:r>
-      <w:proofErr w:type="gramEnd"/>
-      <w:r>
-        <w:rPr>
-          <w:rFonts w:ascii="Arial Narrow" w:eastAsia="Arial Narrow" w:hAnsi="Arial Narrow" w:cs="Arial Narrow"/>
-          <w:sz w:val="20"/>
-          <w:szCs w:val="20"/>
-          <w:lang w:val="en-GB"/>
-        </w:rPr>
-        <w:t>.graduation_</w:t>
-      </w:r>
-      <w:proofErr w:type="gramStart"/>
-      <w:r>
-        <w:rPr>
-          <w:rFonts w:ascii="Arial Narrow" w:eastAsia="Arial Narrow" w:hAnsi="Arial Narrow" w:cs="Arial Narrow"/>
-          <w:sz w:val="20"/>
-          <w:szCs w:val="20"/>
-          <w:lang w:val="en-GB"/>
-        </w:rPr>
-        <w:t>year</w:t>
       </w:r>
       <w:proofErr w:type="spellEnd"/>
       <w:r>
@@ -1444,299 +1771,6 @@
           <w:szCs w:val="20"/>
           <w:lang w:val="en-GB"/>
         </w:rPr>
-        <w:t xml:space="preserve"> }</w:t>
-      </w:r>
-      <w:proofErr w:type="gramEnd"/>
-      <w:r>
-        <w:rPr>
-          <w:rFonts w:ascii="Arial Narrow" w:eastAsia="Arial Narrow" w:hAnsi="Arial Narrow" w:cs="Arial Narrow"/>
-          <w:sz w:val="20"/>
-          <w:szCs w:val="20"/>
-          <w:lang w:val="en-GB"/>
-        </w:rPr>
-        <w:t xml:space="preserve">} </w:t>
-      </w:r>
-      <w:proofErr w:type="gramStart"/>
-      <w:r>
-        <w:rPr>
-          <w:rFonts w:ascii="Arial Narrow" w:eastAsia="Arial Narrow" w:hAnsi="Arial Narrow" w:cs="Arial Narrow"/>
-          <w:sz w:val="20"/>
-          <w:szCs w:val="20"/>
-          <w:lang w:val="en-GB"/>
-        </w:rPr>
-        <w:t xml:space="preserve">   {{ </w:t>
-      </w:r>
-      <w:proofErr w:type="spellStart"/>
-      <w:r>
-        <w:rPr>
-          <w:rFonts w:ascii="Arial Narrow" w:eastAsia="Arial Narrow" w:hAnsi="Arial Narrow" w:cs="Arial Narrow"/>
-          <w:sz w:val="20"/>
-          <w:szCs w:val="20"/>
-          <w:lang w:val="en-GB"/>
-        </w:rPr>
-        <w:t>edu</w:t>
-      </w:r>
-      <w:proofErr w:type="gramEnd"/>
-      <w:r>
-        <w:rPr>
-          <w:rFonts w:ascii="Arial Narrow" w:eastAsia="Arial Narrow" w:hAnsi="Arial Narrow" w:cs="Arial Narrow"/>
-          <w:sz w:val="20"/>
-          <w:szCs w:val="20"/>
-          <w:lang w:val="en-GB"/>
-        </w:rPr>
-        <w:t>.degree_</w:t>
-      </w:r>
-      <w:proofErr w:type="gramStart"/>
-      <w:r>
-        <w:rPr>
-          <w:rFonts w:ascii="Arial Narrow" w:eastAsia="Arial Narrow" w:hAnsi="Arial Narrow" w:cs="Arial Narrow"/>
-          <w:sz w:val="20"/>
-          <w:szCs w:val="20"/>
-          <w:lang w:val="en-GB"/>
-        </w:rPr>
-        <w:t>level</w:t>
-      </w:r>
-      <w:proofErr w:type="spellEnd"/>
-      <w:r>
-        <w:rPr>
-          <w:rFonts w:ascii="Arial Narrow" w:eastAsia="Arial Narrow" w:hAnsi="Arial Narrow" w:cs="Arial Narrow"/>
-          <w:sz w:val="20"/>
-          <w:szCs w:val="20"/>
-          <w:lang w:val="en-GB"/>
-        </w:rPr>
-        <w:t xml:space="preserve"> }</w:t>
-      </w:r>
-      <w:proofErr w:type="gramEnd"/>
-      <w:r>
-        <w:rPr>
-          <w:rFonts w:ascii="Arial Narrow" w:eastAsia="Arial Narrow" w:hAnsi="Arial Narrow" w:cs="Arial Narrow"/>
-          <w:sz w:val="20"/>
-          <w:szCs w:val="20"/>
-          <w:lang w:val="en-GB"/>
-        </w:rPr>
-        <w:t xml:space="preserve">}  </w:t>
-      </w:r>
-      <w:proofErr w:type="gramStart"/>
-      <w:r>
-        <w:rPr>
-          <w:rFonts w:ascii="Arial Narrow" w:eastAsia="Arial Narrow" w:hAnsi="Arial Narrow" w:cs="Arial Narrow"/>
-          <w:sz w:val="20"/>
-          <w:szCs w:val="20"/>
-          <w:lang w:val="en-GB"/>
-        </w:rPr>
-        <w:t xml:space="preserve">–  {{ </w:t>
-      </w:r>
-      <w:proofErr w:type="spellStart"/>
-      <w:r>
-        <w:rPr>
-          <w:rFonts w:ascii="Arial Narrow" w:eastAsia="Arial Narrow" w:hAnsi="Arial Narrow" w:cs="Arial Narrow"/>
-          <w:sz w:val="20"/>
-          <w:szCs w:val="20"/>
-          <w:lang w:val="en-GB"/>
-        </w:rPr>
-        <w:t>edu</w:t>
-      </w:r>
-      <w:proofErr w:type="gramEnd"/>
-      <w:r>
-        <w:rPr>
-          <w:rFonts w:ascii="Arial Narrow" w:eastAsia="Arial Narrow" w:hAnsi="Arial Narrow" w:cs="Arial Narrow"/>
-          <w:sz w:val="20"/>
-          <w:szCs w:val="20"/>
-          <w:lang w:val="en-GB"/>
-        </w:rPr>
-        <w:t>.field_of_</w:t>
-      </w:r>
-      <w:proofErr w:type="gramStart"/>
-      <w:r>
-        <w:rPr>
-          <w:rFonts w:ascii="Arial Narrow" w:eastAsia="Arial Narrow" w:hAnsi="Arial Narrow" w:cs="Arial Narrow"/>
-          <w:sz w:val="20"/>
-          <w:szCs w:val="20"/>
-          <w:lang w:val="en-GB"/>
-        </w:rPr>
-        <w:t>study</w:t>
-      </w:r>
-      <w:proofErr w:type="spellEnd"/>
-      <w:r>
-        <w:rPr>
-          <w:rFonts w:ascii="Arial Narrow" w:eastAsia="Arial Narrow" w:hAnsi="Arial Narrow" w:cs="Arial Narrow"/>
-          <w:sz w:val="20"/>
-          <w:szCs w:val="20"/>
-          <w:lang w:val="en-GB"/>
-        </w:rPr>
-        <w:t xml:space="preserve"> }</w:t>
-      </w:r>
-      <w:proofErr w:type="gramEnd"/>
-      <w:r>
-        <w:rPr>
-          <w:rFonts w:ascii="Arial Narrow" w:eastAsia="Arial Narrow" w:hAnsi="Arial Narrow" w:cs="Arial Narrow"/>
-          <w:sz w:val="20"/>
-          <w:szCs w:val="20"/>
-          <w:lang w:val="en-GB"/>
-        </w:rPr>
-        <w:t xml:space="preserve">} </w:t>
-      </w:r>
-      <w:proofErr w:type="gramStart"/>
-      <w:r>
-        <w:rPr>
-          <w:rFonts w:ascii="Arial Narrow" w:eastAsia="Arial Narrow" w:hAnsi="Arial Narrow" w:cs="Arial Narrow"/>
-          <w:sz w:val="20"/>
-          <w:szCs w:val="20"/>
-          <w:lang w:val="en-GB"/>
-        </w:rPr>
-        <w:t xml:space="preserve">   {{ </w:t>
-      </w:r>
-      <w:proofErr w:type="spellStart"/>
-      <w:r>
-        <w:rPr>
-          <w:rFonts w:ascii="Arial Narrow" w:eastAsia="Arial Narrow" w:hAnsi="Arial Narrow" w:cs="Arial Narrow"/>
-          <w:sz w:val="20"/>
-          <w:szCs w:val="20"/>
-          <w:lang w:val="en-GB"/>
-        </w:rPr>
-        <w:t>edu</w:t>
-      </w:r>
-      <w:proofErr w:type="gramEnd"/>
-      <w:r>
-        <w:rPr>
-          <w:rFonts w:ascii="Arial Narrow" w:eastAsia="Arial Narrow" w:hAnsi="Arial Narrow" w:cs="Arial Narrow"/>
-          <w:sz w:val="20"/>
-          <w:szCs w:val="20"/>
-          <w:lang w:val="en-GB"/>
-        </w:rPr>
-        <w:t>.</w:t>
-      </w:r>
-      <w:proofErr w:type="gramStart"/>
-      <w:r>
-        <w:rPr>
-          <w:rFonts w:ascii="Arial Narrow" w:eastAsia="Arial Narrow" w:hAnsi="Arial Narrow" w:cs="Arial Narrow"/>
-          <w:sz w:val="20"/>
-          <w:szCs w:val="20"/>
-          <w:lang w:val="en-GB"/>
-        </w:rPr>
-        <w:t>institution</w:t>
-      </w:r>
-      <w:proofErr w:type="spellEnd"/>
-      <w:r>
-        <w:rPr>
-          <w:rFonts w:ascii="Arial Narrow" w:eastAsia="Arial Narrow" w:hAnsi="Arial Narrow" w:cs="Arial Narrow"/>
-          <w:sz w:val="20"/>
-          <w:szCs w:val="20"/>
-          <w:lang w:val="en-GB"/>
-        </w:rPr>
-        <w:t xml:space="preserve"> }}{</w:t>
-      </w:r>
-      <w:proofErr w:type="gramEnd"/>
-      <w:r>
-        <w:rPr>
-          <w:rFonts w:ascii="Arial Narrow" w:eastAsia="Arial Narrow" w:hAnsi="Arial Narrow" w:cs="Arial Narrow"/>
-          <w:sz w:val="20"/>
-          <w:szCs w:val="20"/>
-          <w:lang w:val="en-GB"/>
-        </w:rPr>
-        <w:t xml:space="preserve">% if </w:t>
-      </w:r>
-      <w:proofErr w:type="spellStart"/>
-      <w:proofErr w:type="gramStart"/>
-      <w:r>
-        <w:rPr>
-          <w:rFonts w:ascii="Arial Narrow" w:eastAsia="Arial Narrow" w:hAnsi="Arial Narrow" w:cs="Arial Narrow"/>
-          <w:sz w:val="20"/>
-          <w:szCs w:val="20"/>
-          <w:lang w:val="en-GB"/>
-        </w:rPr>
-        <w:t>edu.grade</w:t>
-      </w:r>
-      <w:proofErr w:type="spellEnd"/>
-      <w:proofErr w:type="gramEnd"/>
-      <w:r>
-        <w:rPr>
-          <w:rFonts w:ascii="Arial Narrow" w:eastAsia="Arial Narrow" w:hAnsi="Arial Narrow" w:cs="Arial Narrow"/>
-          <w:sz w:val="20"/>
-          <w:szCs w:val="20"/>
-          <w:lang w:val="en-GB"/>
-        </w:rPr>
-        <w:t xml:space="preserve"> </w:t>
-      </w:r>
-      <w:proofErr w:type="gramStart"/>
-      <w:r>
-        <w:rPr>
-          <w:rFonts w:ascii="Arial Narrow" w:eastAsia="Arial Narrow" w:hAnsi="Arial Narrow" w:cs="Arial Narrow"/>
-          <w:sz w:val="20"/>
-          <w:szCs w:val="20"/>
-          <w:lang w:val="en-GB"/>
-        </w:rPr>
-        <w:t>%}  –</w:t>
-      </w:r>
-      <w:proofErr w:type="gramEnd"/>
-      <w:r>
-        <w:rPr>
-          <w:rFonts w:ascii="Arial Narrow" w:eastAsia="Arial Narrow" w:hAnsi="Arial Narrow" w:cs="Arial Narrow"/>
-          <w:sz w:val="20"/>
-          <w:szCs w:val="20"/>
-          <w:lang w:val="en-GB"/>
-        </w:rPr>
-        <w:t xml:space="preserve">  </w:t>
-      </w:r>
-      <w:proofErr w:type="gramStart"/>
-      <w:r>
-        <w:rPr>
-          <w:rFonts w:ascii="Arial Narrow" w:eastAsia="Arial Narrow" w:hAnsi="Arial Narrow" w:cs="Arial Narrow"/>
-          <w:sz w:val="20"/>
-          <w:szCs w:val="20"/>
-          <w:lang w:val="en-GB"/>
-        </w:rPr>
-        <w:t xml:space="preserve">{{ </w:t>
-      </w:r>
-      <w:proofErr w:type="spellStart"/>
-      <w:r>
-        <w:rPr>
-          <w:rFonts w:ascii="Arial Narrow" w:eastAsia="Arial Narrow" w:hAnsi="Arial Narrow" w:cs="Arial Narrow"/>
-          <w:sz w:val="20"/>
-          <w:szCs w:val="20"/>
-          <w:lang w:val="en-GB"/>
-        </w:rPr>
-        <w:t>edu</w:t>
-      </w:r>
-      <w:proofErr w:type="gramEnd"/>
-      <w:r>
-        <w:rPr>
-          <w:rFonts w:ascii="Arial Narrow" w:eastAsia="Arial Narrow" w:hAnsi="Arial Narrow" w:cs="Arial Narrow"/>
-          <w:sz w:val="20"/>
-          <w:szCs w:val="20"/>
-          <w:lang w:val="en-GB"/>
-        </w:rPr>
-        <w:t>.</w:t>
-      </w:r>
-      <w:proofErr w:type="gramStart"/>
-      <w:r>
-        <w:rPr>
-          <w:rFonts w:ascii="Arial Narrow" w:eastAsia="Arial Narrow" w:hAnsi="Arial Narrow" w:cs="Arial Narrow"/>
-          <w:sz w:val="20"/>
-          <w:szCs w:val="20"/>
-          <w:lang w:val="en-GB"/>
-        </w:rPr>
-        <w:t>grade</w:t>
-      </w:r>
-      <w:proofErr w:type="spellEnd"/>
-      <w:r>
-        <w:rPr>
-          <w:rFonts w:ascii="Arial Narrow" w:eastAsia="Arial Narrow" w:hAnsi="Arial Narrow" w:cs="Arial Narrow"/>
-          <w:sz w:val="20"/>
-          <w:szCs w:val="20"/>
-          <w:lang w:val="en-GB"/>
-        </w:rPr>
-        <w:t xml:space="preserve"> }}{</w:t>
-      </w:r>
-      <w:proofErr w:type="gramEnd"/>
-      <w:r>
-        <w:rPr>
-          <w:rFonts w:ascii="Arial Narrow" w:eastAsia="Arial Narrow" w:hAnsi="Arial Narrow" w:cs="Arial Narrow"/>
-          <w:sz w:val="20"/>
-          <w:szCs w:val="20"/>
-          <w:lang w:val="en-GB"/>
-        </w:rPr>
-        <w:t>% endif %}</w:t>
       </w:r>
     </w:p>
     <w:p>
@@ -1767,27 +1801,7 @@
           <w:szCs w:val="20"/>
           <w:lang w:val="en-GB"/>
         </w:rPr>
-        <w:t xml:space="preserve">{%tr </w:t>
-      </w:r>
-      <w:proofErr w:type="spellStart"/>
-      <w:r>
-        <w:rPr>
-          <w:rFonts w:ascii="Arial Narrow" w:eastAsia="Arial Narrow" w:hAnsi="Arial Narrow" w:cs="Arial Narrow"/>
-          <w:sz w:val="20"/>
-          <w:szCs w:val="20"/>
-          <w:lang w:val="en-GB"/>
-        </w:rPr>
-        <w:t>endfor</w:t>
-      </w:r>
-      <w:proofErr w:type="spellEnd"/>
-      <w:r>
-        <w:rPr>
-          <w:rFonts w:ascii="Arial Narrow" w:eastAsia="Arial Narrow" w:hAnsi="Arial Narrow" w:cs="Arial Narrow"/>
-          <w:sz w:val="20"/>
-          <w:szCs w:val="20"/>
-          <w:lang w:val="en-GB"/>
-        </w:rPr>
-        <w:t xml:space="preserve"> %}</w:t>
+        <w:t>CERTIFICAZIONI:</w:t>
       </w:r>
     </w:p>
     <w:p>
@@ -1800,45 +1814,14 @@
           <w:lang w:val="en-GB"/>
         </w:rPr>
       </w:pPr>
-    </w:p>
-    <w:p>
-      <w:pPr>
-        <w:spacing w:after="0"/>
-        <w:rPr>
-          <w:rFonts w:ascii="Arial Narrow" w:eastAsia="Arial Narrow" w:hAnsi="Arial Narrow" w:cs="Arial Narrow"/>
-          <w:sz w:val="20"/>
-          <w:szCs w:val="20"/>
-          <w:lang w:val="en-GB"/>
-        </w:rPr>
-      </w:pPr>
-      <w:r>
-        <w:rPr>
-          <w:rFonts w:ascii="Arial Narrow" w:eastAsia="Arial Narrow" w:hAnsi="Arial Narrow" w:cs="Arial Narrow"/>
-          <w:sz w:val="20"/>
-          <w:szCs w:val="20"/>
-          <w:lang w:val="en-GB"/>
-        </w:rPr>
-        <w:t>CERTIFICAZIONI:</w:t>
-      </w:r>
-    </w:p>
-    <w:p>
-      <w:pPr>
-        <w:spacing w:after="0"/>
-        <w:rPr>
-          <w:rFonts w:ascii="Arial Narrow" w:eastAsia="Arial Narrow" w:hAnsi="Arial Narrow" w:cs="Arial Narrow"/>
-          <w:sz w:val="20"/>
-          <w:szCs w:val="20"/>
-          <w:lang w:val="en-GB"/>
-        </w:rPr>
-      </w:pPr>
-      <w:r>
-        <w:rPr>
-          <w:rFonts w:ascii="Arial Narrow" w:eastAsia="Arial Narrow" w:hAnsi="Arial Narrow" w:cs="Arial Narrow"/>
-          <w:sz w:val="20"/>
-          <w:szCs w:val="20"/>
-          <w:lang w:val="en-GB"/>
-        </w:rPr>
-        <w:t>{%tr for cert in certifications %}</w:t>
+      <w:r>
+        <w:rPr>
+          <w:rFonts w:ascii="Arial Narrow" w:eastAsia="Arial Narrow" w:hAnsi="Arial Narrow" w:cs="Arial Narrow"/>
+          <w:sz w:val="20"/>
+          <w:szCs w:val="20"/>
+          <w:lang w:val="en-GB"/>
+        </w:rPr>
+        <w:t>{%p for cert in certifications %}</w:t>
       </w:r>
     </w:p>
     <w:p>
@@ -2265,7 +2248,7 @@
           <w:szCs w:val="20"/>
           <w:lang w:val="en-GB"/>
         </w:rPr>
-        <w:t xml:space="preserve">{%tr </w:t>
+        <w:t>{%p endfor %}</w:t>
       </w:r>
       <w:proofErr w:type="spellStart"/>
       <w:r>
@@ -2275,7 +2258,6 @@
           <w:szCs w:val="20"/>
           <w:lang w:val="en-GB"/>
         </w:rPr>
-        <w:t>endfor</w:t>
       </w:r>
       <w:proofErr w:type="spellEnd"/>
       <w:r>
@@ -2285,7 +2267,6 @@
           <w:szCs w:val="20"/>
           <w:lang w:val="en-GB"/>
         </w:rPr>
-        <w:t xml:space="preserve"> %}</w:t>
       </w:r>
     </w:p>
     <w:p>
@@ -2347,7 +2328,7 @@
           <w:szCs w:val="20"/>
           <w:lang w:val="en-GB" w:eastAsia="it-IT"/>
         </w:rPr>
-        <w:t xml:space="preserve">{%tr for </w:t>
+        <w:t>{%p for sk in skills_hard %}</w:t>
       </w:r>
       <w:proofErr w:type="spellStart"/>
       <w:r>
@@ -2357,7 +2338,6 @@
           <w:szCs w:val="20"/>
           <w:lang w:val="en-GB" w:eastAsia="it-IT"/>
         </w:rPr>
-        <w:t>sk</w:t>
       </w:r>
       <w:proofErr w:type="spellEnd"/>
       <w:r>
@@ -2367,7 +2347,6 @@
           <w:szCs w:val="20"/>
           <w:lang w:val="en-GB" w:eastAsia="it-IT"/>
         </w:rPr>
-        <w:t xml:space="preserve"> in </w:t>
       </w:r>
       <w:proofErr w:type="spellStart"/>
       <w:r>
@@ -2377,7 +2356,6 @@
           <w:szCs w:val="20"/>
           <w:lang w:val="en-GB" w:eastAsia="it-IT"/>
         </w:rPr>
-        <w:t>skills_hard</w:t>
       </w:r>
       <w:proofErr w:type="spellEnd"/>
       <w:r>
@@ -2387,7 +2365,6 @@
           <w:szCs w:val="20"/>
           <w:lang w:val="en-GB" w:eastAsia="it-IT"/>
         </w:rPr>
-        <w:t xml:space="preserve"> %}</w:t>
       </w:r>
     </w:p>
     <w:p>
@@ -2543,7 +2520,7 @@
           <w:szCs w:val="20"/>
           <w:lang w:val="en-GB" w:eastAsia="it-IT"/>
         </w:rPr>
-        <w:t xml:space="preserve">{%tr </w:t>
+        <w:t>{%p endfor %}</w:t>
       </w:r>
       <w:proofErr w:type="spellStart"/>
       <w:r>
@@ -2553,7 +2530,6 @@
           <w:szCs w:val="20"/>
           <w:lang w:val="en-GB" w:eastAsia="it-IT"/>
         </w:rPr>
-        <w:t>endfor</w:t>
       </w:r>
       <w:proofErr w:type="spellEnd"/>
       <w:r>
@@ -2563,7 +2539,6 @@
           <w:szCs w:val="20"/>
           <w:lang w:val="en-GB" w:eastAsia="it-IT"/>
         </w:rPr>
-        <w:t xml:space="preserve"> %}</w:t>
       </w:r>
     </w:p>
     <w:p>
@@ -2604,7 +2579,7 @@
           <w:szCs w:val="20"/>
           <w:lang w:val="en-GB" w:eastAsia="it-IT"/>
         </w:rPr>
-        <w:t xml:space="preserve">{%tr for </w:t>
+        <w:t>{%p for sk in skills_soft %}</w:t>
       </w:r>
       <w:proofErr w:type="spellStart"/>
       <w:r>
@@ -2614,7 +2589,6 @@
           <w:szCs w:val="20"/>
           <w:lang w:val="en-GB" w:eastAsia="it-IT"/>
         </w:rPr>
-        <w:t>sk</w:t>
       </w:r>
       <w:proofErr w:type="spellEnd"/>
       <w:r>
@@ -2624,7 +2598,6 @@
           <w:szCs w:val="20"/>
           <w:lang w:val="en-GB" w:eastAsia="it-IT"/>
         </w:rPr>
-        <w:t xml:space="preserve"> in </w:t>
       </w:r>
       <w:proofErr w:type="spellStart"/>
       <w:r>
@@ -2634,7 +2607,6 @@
           <w:szCs w:val="20"/>
           <w:lang w:val="en-GB" w:eastAsia="it-IT"/>
         </w:rPr>
-        <w:t>skills_soft</w:t>
       </w:r>
       <w:proofErr w:type="spellEnd"/>
       <w:r>
@@ -2644,7 +2616,6 @@
           <w:szCs w:val="20"/>
           <w:lang w:val="en-GB" w:eastAsia="it-IT"/>
         </w:rPr>
-        <w:t xml:space="preserve"> %}</w:t>
       </w:r>
     </w:p>
     <w:p>
@@ -2800,7 +2771,7 @@
           <w:szCs w:val="20"/>
           <w:lang w:val="en-GB" w:eastAsia="it-IT"/>
         </w:rPr>
-        <w:t xml:space="preserve">{%tr </w:t>
+        <w:t>{%p endfor %}</w:t>
       </w:r>
       <w:proofErr w:type="spellStart"/>
       <w:r>
@@ -2810,7 +2781,6 @@
           <w:szCs w:val="20"/>
           <w:lang w:val="en-GB" w:eastAsia="it-IT"/>
         </w:rPr>
-        <w:t>endfor</w:t>
       </w:r>
       <w:proofErr w:type="spellEnd"/>
       <w:r>
@@ -2820,7 +2790,6 @@
           <w:szCs w:val="20"/>
           <w:lang w:val="en-GB" w:eastAsia="it-IT"/>
         </w:rPr>
-        <w:t xml:space="preserve"> %}</w:t>
       </w:r>
     </w:p>
     <w:p>
@@ -2883,7 +2852,7 @@
           <w:szCs w:val="20"/>
           <w:lang w:val="en-GB"/>
         </w:rPr>
-        <w:t>{%tr for lang in languages %}</w:t>
+        <w:t>{%p for lang in languages %}</w:t>
       </w:r>
     </w:p>
     <w:p>
@@ -3029,15 +2998,17 @@
           <w:rFonts w:ascii="Arial Narrow" w:eastAsia="Arial Narrow" w:hAnsi="Arial Narrow" w:cs="Arial Narrow"/>
           <w:sz w:val="20"/>
           <w:szCs w:val="20"/>
-        </w:rPr>
-      </w:pPr>
-      <w:r>
-        <w:rPr>
-          <w:rFonts w:ascii="Arial Narrow" w:eastAsia="Arial Narrow" w:hAnsi="Arial Narrow" w:cs="Arial Narrow"/>
-          <w:sz w:val="20"/>
-          <w:szCs w:val="20"/>
-        </w:rPr>
-        <w:t>{%</w:t>
+          <w:lang w:val="en-GB"/>
+        </w:rPr>
+      </w:pPr>
+      <w:r>
+        <w:rPr>
+          <w:rFonts w:ascii="Arial Narrow" w:eastAsia="Arial Narrow" w:hAnsi="Arial Narrow" w:cs="Arial Narrow"/>
+          <w:sz w:val="20"/>
+          <w:szCs w:val="20"/>
+          <w:lang w:val="en-GB"/>
+        </w:rPr>
+        <w:t>{%p endfor %}</w:t>
       </w:r>
       <w:proofErr w:type="spellStart"/>
       <w:r>
@@ -3045,8 +3016,8 @@
           <w:rFonts w:ascii="Arial Narrow" w:eastAsia="Arial Narrow" w:hAnsi="Arial Narrow" w:cs="Arial Narrow"/>
           <w:sz w:val="20"/>
           <w:szCs w:val="20"/>
-        </w:rPr>
-        <w:t>tr</w:t>
+          <w:lang w:val="en-GB"/>
+        </w:rPr>
       </w:r>
       <w:proofErr w:type="spellEnd"/>
       <w:r>
@@ -3054,26 +3025,8 @@
           <w:rFonts w:ascii="Arial Narrow" w:eastAsia="Arial Narrow" w:hAnsi="Arial Narrow" w:cs="Arial Narrow"/>
           <w:sz w:val="20"/>
           <w:szCs w:val="20"/>
-        </w:rPr>
-        <w:t xml:space="preserve"> </w:t>
-      </w:r>
-      <w:proofErr w:type="spellStart"/>
-      <w:r>
-        <w:rPr>
-          <w:rFonts w:ascii="Arial Narrow" w:eastAsia="Arial Narrow" w:hAnsi="Arial Narrow" w:cs="Arial Narrow"/>
-          <w:sz w:val="20"/>
-          <w:szCs w:val="20"/>
-        </w:rPr>
-        <w:t>endfor</w:t>
-      </w:r>
-      <w:proofErr w:type="spellEnd"/>
-      <w:r>
-        <w:rPr>
-          <w:rFonts w:ascii="Arial Narrow" w:eastAsia="Arial Narrow" w:hAnsi="Arial Narrow" w:cs="Arial Narrow"/>
-          <w:sz w:val="20"/>
-          <w:szCs w:val="20"/>
-        </w:rPr>
-        <w:t xml:space="preserve"> %}</w:t>
+          <w:lang w:val="en-GB"/>
+        </w:rPr>
       </w:r>
     </w:p>
     <w:p>
@@ -3083,6 +3036,7 @@
           <w:rFonts w:ascii="Arial Narrow" w:eastAsia="Arial Narrow" w:hAnsi="Arial Narrow" w:cs="Arial Narrow"/>
           <w:sz w:val="20"/>
           <w:szCs w:val="20"/>
+          <w:lang w:val="en-GB"/>
         </w:rPr>
       </w:pPr>
     </w:p>
@@ -3093,6 +3047,7 @@
           <w:rFonts w:ascii="Arial Narrow" w:eastAsia="Arial Narrow" w:hAnsi="Arial Narrow" w:cs="Arial Narrow"/>
           <w:sz w:val="20"/>
           <w:szCs w:val="20"/>
+          <w:lang w:val="en-GB"/>
         </w:rPr>
       </w:pPr>
     </w:p>

</xml_diff>